<commit_message>
Update project document and link it in README
</commit_message>
<xml_diff>
--- a/docs/DOC.docx
+++ b/docs/DOC.docx
@@ -47,7 +47,7 @@
           <w:rFonts w:ascii="Times New Roman" w:hAnsi="Times New Roman" w:cs="Times New Roman"/>
         </w:rPr>
         <w:pict w14:anchorId="325BB484">
-          <v:rect id="_x0000_i1205" style="width:0;height:1.5pt" o:hralign="center" o:hrstd="t" o:hr="t" fillcolor="#a0a0a0" stroked="f"/>
+          <v:rect id="_x0000_i1025" style="width:0;height:1.5pt" o:hralign="center" o:hrstd="t" o:hr="t" fillcolor="#a0a0a0" stroked="f"/>
         </w:pict>
       </w:r>
     </w:p>
@@ -144,7 +144,7 @@
           <w:rFonts w:ascii="Times New Roman" w:hAnsi="Times New Roman" w:cs="Times New Roman"/>
         </w:rPr>
         <w:pict w14:anchorId="032904BF">
-          <v:rect id="_x0000_i1206" style="width:0;height:1.5pt" o:hralign="center" o:hrstd="t" o:hr="t" fillcolor="#a0a0a0" stroked="f"/>
+          <v:rect id="_x0000_i1026" style="width:0;height:1.5pt" o:hralign="center" o:hrstd="t" o:hr="t" fillcolor="#a0a0a0" stroked="f"/>
         </w:pict>
       </w:r>
     </w:p>
@@ -357,7 +357,7 @@
           <w:rFonts w:ascii="Times New Roman" w:hAnsi="Times New Roman" w:cs="Times New Roman"/>
         </w:rPr>
         <w:pict w14:anchorId="57A7D03A">
-          <v:rect id="_x0000_i1207" style="width:0;height:1.5pt" o:hralign="center" o:hrstd="t" o:hr="t" fillcolor="#a0a0a0" stroked="f"/>
+          <v:rect id="_x0000_i1027" style="width:0;height:1.5pt" o:hralign="center" o:hrstd="t" o:hr="t" fillcolor="#a0a0a0" stroked="f"/>
         </w:pict>
       </w:r>
     </w:p>
@@ -555,7 +555,7 @@
           <w:rFonts w:ascii="Times New Roman" w:hAnsi="Times New Roman" w:cs="Times New Roman"/>
         </w:rPr>
         <w:pict w14:anchorId="5BEC2DCB">
-          <v:rect id="_x0000_i1208" style="width:0;height:1.5pt" o:hralign="center" o:hrstd="t" o:hr="t" fillcolor="#a0a0a0" stroked="f"/>
+          <v:rect id="_x0000_i1028" style="width:0;height:1.5pt" o:hralign="center" o:hrstd="t" o:hr="t" fillcolor="#a0a0a0" stroked="f"/>
         </w:pict>
       </w:r>
     </w:p>
@@ -826,7 +826,7 @@
           <w:rFonts w:ascii="Times New Roman" w:hAnsi="Times New Roman" w:cs="Times New Roman"/>
         </w:rPr>
         <w:pict w14:anchorId="0EA5A4BC">
-          <v:rect id="_x0000_i1209" style="width:0;height:1.5pt" o:hralign="center" o:hrstd="t" o:hr="t" fillcolor="#a0a0a0" stroked="f"/>
+          <v:rect id="_x0000_i1029" style="width:0;height:1.5pt" o:hralign="center" o:hrstd="t" o:hr="t" fillcolor="#a0a0a0" stroked="f"/>
         </w:pict>
       </w:r>
     </w:p>
@@ -1439,7 +1439,7 @@
           <w:rFonts w:ascii="Times New Roman" w:hAnsi="Times New Roman" w:cs="Times New Roman"/>
         </w:rPr>
         <w:pict w14:anchorId="03AD6790">
-          <v:rect id="_x0000_i1210" style="width:0;height:1.5pt" o:hralign="center" o:hrstd="t" o:hr="t" fillcolor="#a0a0a0" stroked="f"/>
+          <v:rect id="_x0000_i1030" style="width:0;height:1.5pt" o:hralign="center" o:hrstd="t" o:hr="t" fillcolor="#a0a0a0" stroked="f"/>
         </w:pict>
       </w:r>
     </w:p>
@@ -1688,7 +1688,7 @@
           <w:rFonts w:ascii="Times New Roman" w:hAnsi="Times New Roman" w:cs="Times New Roman"/>
         </w:rPr>
         <w:pict w14:anchorId="2E6AB9AF">
-          <v:rect id="_x0000_i1211" style="width:0;height:1.5pt" o:hralign="center" o:hrstd="t" o:hr="t" fillcolor="#a0a0a0" stroked="f"/>
+          <v:rect id="_x0000_i1031" style="width:0;height:1.5pt" o:hralign="center" o:hrstd="t" o:hr="t" fillcolor="#a0a0a0" stroked="f"/>
         </w:pict>
       </w:r>
     </w:p>
@@ -1911,7 +1911,7 @@
           <w:rFonts w:ascii="Times New Roman" w:hAnsi="Times New Roman" w:cs="Times New Roman"/>
         </w:rPr>
         <w:pict w14:anchorId="4F623528">
-          <v:rect id="_x0000_i1212" style="width:0;height:1.5pt" o:hralign="center" o:hrstd="t" o:hr="t" fillcolor="#a0a0a0" stroked="f"/>
+          <v:rect id="_x0000_i1032" style="width:0;height:1.5pt" o:hralign="center" o:hrstd="t" o:hr="t" fillcolor="#a0a0a0" stroked="f"/>
         </w:pict>
       </w:r>
     </w:p>
@@ -2109,7 +2109,7 @@
           <w:rFonts w:ascii="Times New Roman" w:hAnsi="Times New Roman" w:cs="Times New Roman"/>
         </w:rPr>
         <w:pict w14:anchorId="059E1D6C">
-          <v:rect id="_x0000_i1213" style="width:0;height:1.5pt" o:hralign="center" o:hrstd="t" o:hr="t" fillcolor="#a0a0a0" stroked="f"/>
+          <v:rect id="_x0000_i1033" style="width:0;height:1.5pt" o:hralign="center" o:hrstd="t" o:hr="t" fillcolor="#a0a0a0" stroked="f"/>
         </w:pict>
       </w:r>
     </w:p>
@@ -2239,7 +2239,7 @@
           <w:rFonts w:ascii="Times New Roman" w:hAnsi="Times New Roman" w:cs="Times New Roman"/>
         </w:rPr>
         <w:pict w14:anchorId="1DDB5C34">
-          <v:rect id="_x0000_i1214" style="width:0;height:1.5pt" o:hralign="center" o:hrstd="t" o:hr="t" fillcolor="#a0a0a0" stroked="f"/>
+          <v:rect id="_x0000_i1034" style="width:0;height:1.5pt" o:hralign="center" o:hrstd="t" o:hr="t" fillcolor="#a0a0a0" stroked="f"/>
         </w:pict>
       </w:r>
     </w:p>
@@ -2362,7 +2362,7 @@
           <w:rFonts w:ascii="Times New Roman" w:hAnsi="Times New Roman" w:cs="Times New Roman"/>
         </w:rPr>
         <w:pict w14:anchorId="036CF190">
-          <v:rect id="_x0000_i1215" style="width:0;height:1.5pt" o:hralign="center" o:hrstd="t" o:hr="t" fillcolor="#a0a0a0" stroked="f"/>
+          <v:rect id="_x0000_i1035" style="width:0;height:1.5pt" o:hralign="center" o:hrstd="t" o:hr="t" fillcolor="#a0a0a0" stroked="f"/>
         </w:pict>
       </w:r>
     </w:p>
@@ -2707,7 +2707,7 @@
           <w:rFonts w:ascii="Times New Roman" w:hAnsi="Times New Roman" w:cs="Times New Roman"/>
         </w:rPr>
         <w:pict w14:anchorId="057BDD69">
-          <v:rect id="_x0000_i1216" style="width:0;height:1.5pt" o:hralign="center" o:hrstd="t" o:hr="t" fillcolor="#a0a0a0" stroked="f"/>
+          <v:rect id="_x0000_i1036" style="width:0;height:1.5pt" o:hralign="center" o:hrstd="t" o:hr="t" fillcolor="#a0a0a0" stroked="f"/>
         </w:pict>
       </w:r>
     </w:p>
@@ -2752,7 +2752,7 @@
           <w:rFonts w:ascii="Times New Roman" w:hAnsi="Times New Roman" w:cs="Times New Roman"/>
         </w:rPr>
         <w:pict w14:anchorId="7BE9AC2E">
-          <v:rect id="_x0000_i1217" style="width:0;height:1.5pt" o:hralign="center" o:hrstd="t" o:hr="t" fillcolor="#a0a0a0" stroked="f"/>
+          <v:rect id="_x0000_i1037" style="width:0;height:1.5pt" o:hralign="center" o:hrstd="t" o:hr="t" fillcolor="#a0a0a0" stroked="f"/>
         </w:pict>
       </w:r>
     </w:p>
@@ -2905,7 +2905,7 @@
           <w:rFonts w:ascii="Times New Roman" w:hAnsi="Times New Roman" w:cs="Times New Roman"/>
         </w:rPr>
         <w:pict w14:anchorId="4E7F52E7">
-          <v:rect id="_x0000_i1218" style="width:0;height:1.5pt" o:hralign="center" o:hrstd="t" o:hr="t" fillcolor="#a0a0a0" stroked="f"/>
+          <v:rect id="_x0000_i1038" style="width:0;height:1.5pt" o:hralign="center" o:hrstd="t" o:hr="t" fillcolor="#a0a0a0" stroked="f"/>
         </w:pict>
       </w:r>
     </w:p>
@@ -3386,7 +3386,7 @@
           <w:rFonts w:ascii="Times New Roman" w:hAnsi="Times New Roman" w:cs="Times New Roman"/>
         </w:rPr>
         <w:pict w14:anchorId="059C3ADE">
-          <v:rect id="_x0000_i1219" style="width:0;height:1.5pt" o:hralign="center" o:hrstd="t" o:hr="t" fillcolor="#a0a0a0" stroked="f"/>
+          <v:rect id="_x0000_i1039" style="width:0;height:1.5pt" o:hralign="center" o:hrstd="t" o:hr="t" fillcolor="#a0a0a0" stroked="f"/>
         </w:pict>
       </w:r>
     </w:p>
@@ -3669,7 +3669,7 @@
           <w:rFonts w:ascii="Times New Roman" w:hAnsi="Times New Roman" w:cs="Times New Roman"/>
         </w:rPr>
         <w:pict w14:anchorId="558B0D0C">
-          <v:rect id="_x0000_i1220" style="width:0;height:1.5pt" o:hralign="center" o:hrstd="t" o:hr="t" fillcolor="#a0a0a0" stroked="f"/>
+          <v:rect id="_x0000_i1040" style="width:0;height:1.5pt" o:hralign="center" o:hrstd="t" o:hr="t" fillcolor="#a0a0a0" stroked="f"/>
         </w:pict>
       </w:r>
     </w:p>
@@ -3862,7 +3862,7 @@
           <w:rFonts w:ascii="Times New Roman" w:hAnsi="Times New Roman" w:cs="Times New Roman"/>
         </w:rPr>
         <w:pict w14:anchorId="52805A41">
-          <v:rect id="_x0000_i1221" style="width:0;height:1.5pt" o:hralign="center" o:hrstd="t" o:hr="t" fillcolor="#a0a0a0" stroked="f"/>
+          <v:rect id="_x0000_i1041" style="width:0;height:1.5pt" o:hralign="center" o:hrstd="t" o:hr="t" fillcolor="#a0a0a0" stroked="f"/>
         </w:pict>
       </w:r>
     </w:p>
@@ -4055,7 +4055,7 @@
           <w:rFonts w:ascii="Times New Roman" w:hAnsi="Times New Roman" w:cs="Times New Roman"/>
         </w:rPr>
         <w:pict w14:anchorId="211341BD">
-          <v:rect id="_x0000_i1222" style="width:0;height:1.5pt" o:hralign="center" o:hrstd="t" o:hr="t" fillcolor="#a0a0a0" stroked="f"/>
+          <v:rect id="_x0000_i1042" style="width:0;height:1.5pt" o:hralign="center" o:hrstd="t" o:hr="t" fillcolor="#a0a0a0" stroked="f"/>
         </w:pict>
       </w:r>
     </w:p>
@@ -4248,7 +4248,7 @@
           <w:rFonts w:ascii="Times New Roman" w:hAnsi="Times New Roman" w:cs="Times New Roman"/>
         </w:rPr>
         <w:pict w14:anchorId="7ACDA621">
-          <v:rect id="_x0000_i1223" style="width:0;height:1.5pt" o:hralign="center" o:hrstd="t" o:hr="t" fillcolor="#a0a0a0" stroked="f"/>
+          <v:rect id="_x0000_i1043" style="width:0;height:1.5pt" o:hralign="center" o:hrstd="t" o:hr="t" fillcolor="#a0a0a0" stroked="f"/>
         </w:pict>
       </w:r>
     </w:p>
@@ -4429,7 +4429,7 @@
           <w:rFonts w:ascii="Times New Roman" w:hAnsi="Times New Roman" w:cs="Times New Roman"/>
         </w:rPr>
         <w:pict w14:anchorId="3E6B4237">
-          <v:rect id="_x0000_i1224" style="width:0;height:1.5pt" o:hralign="center" o:hrstd="t" o:hr="t" fillcolor="#a0a0a0" stroked="f"/>
+          <v:rect id="_x0000_i1044" style="width:0;height:1.5pt" o:hralign="center" o:hrstd="t" o:hr="t" fillcolor="#a0a0a0" stroked="f"/>
         </w:pict>
       </w:r>
     </w:p>
@@ -4589,7 +4589,7 @@
           <w:rFonts w:ascii="Times New Roman" w:hAnsi="Times New Roman" w:cs="Times New Roman"/>
         </w:rPr>
         <w:pict w14:anchorId="33D80622">
-          <v:rect id="_x0000_i1225" style="width:0;height:1.5pt" o:hralign="center" o:hrstd="t" o:hr="t" fillcolor="#a0a0a0" stroked="f"/>
+          <v:rect id="_x0000_i1045" style="width:0;height:1.5pt" o:hralign="center" o:hrstd="t" o:hr="t" fillcolor="#a0a0a0" stroked="f"/>
         </w:pict>
       </w:r>
     </w:p>
@@ -4915,7 +4915,7 @@
           <w:rFonts w:ascii="Times New Roman" w:hAnsi="Times New Roman" w:cs="Times New Roman"/>
         </w:rPr>
         <w:pict w14:anchorId="01700B24">
-          <v:rect id="_x0000_i1226" style="width:0;height:1.5pt" o:hralign="center" o:hrstd="t" o:hr="t" fillcolor="#a0a0a0" stroked="f"/>
+          <v:rect id="_x0000_i1046" style="width:0;height:1.5pt" o:hralign="center" o:hrstd="t" o:hr="t" fillcolor="#a0a0a0" stroked="f"/>
         </w:pict>
       </w:r>
     </w:p>
@@ -5042,7 +5042,7 @@
           <w:rFonts w:ascii="Times New Roman" w:hAnsi="Times New Roman" w:cs="Times New Roman"/>
         </w:rPr>
         <w:pict w14:anchorId="42680DD0">
-          <v:rect id="_x0000_i1227" style="width:0;height:1.5pt" o:hralign="center" o:hrstd="t" o:hr="t" fillcolor="#a0a0a0" stroked="f"/>
+          <v:rect id="_x0000_i1047" style="width:0;height:1.5pt" o:hralign="center" o:hrstd="t" o:hr="t" fillcolor="#a0a0a0" stroked="f"/>
         </w:pict>
       </w:r>
     </w:p>
@@ -5151,7 +5151,7 @@
           <w:rFonts w:ascii="Times New Roman" w:hAnsi="Times New Roman" w:cs="Times New Roman"/>
         </w:rPr>
         <w:pict w14:anchorId="2CE6C513">
-          <v:rect id="_x0000_i1228" style="width:0;height:1.5pt" o:hralign="center" o:hrstd="t" o:hr="t" fillcolor="#a0a0a0" stroked="f"/>
+          <v:rect id="_x0000_i1048" style="width:0;height:1.5pt" o:hralign="center" o:hrstd="t" o:hr="t" fillcolor="#a0a0a0" stroked="f"/>
         </w:pict>
       </w:r>
     </w:p>
@@ -5417,7 +5417,7 @@
           <w:rFonts w:ascii="Times New Roman" w:hAnsi="Times New Roman" w:cs="Times New Roman"/>
         </w:rPr>
         <w:pict w14:anchorId="2C23270C">
-          <v:rect id="_x0000_i1229" style="width:0;height:1.5pt" o:hralign="center" o:hrstd="t" o:hr="t" fillcolor="#a0a0a0" stroked="f"/>
+          <v:rect id="_x0000_i1049" style="width:0;height:1.5pt" o:hralign="center" o:hrstd="t" o:hr="t" fillcolor="#a0a0a0" stroked="f"/>
         </w:pict>
       </w:r>
     </w:p>
@@ -5650,7 +5650,7 @@
           <w:rFonts w:ascii="Times New Roman" w:hAnsi="Times New Roman" w:cs="Times New Roman"/>
         </w:rPr>
         <w:pict w14:anchorId="5B9DB33A">
-          <v:rect id="_x0000_i1230" style="width:0;height:1.5pt" o:hralign="center" o:hrstd="t" o:hr="t" fillcolor="#a0a0a0" stroked="f"/>
+          <v:rect id="_x0000_i1050" style="width:0;height:1.5pt" o:hralign="center" o:hrstd="t" o:hr="t" fillcolor="#a0a0a0" stroked="f"/>
         </w:pict>
       </w:r>
     </w:p>
@@ -5954,6 +5954,240 @@
     </w:p>
     <w:p>
       <w:pPr>
+        <w:jc w:val="center"/>
+        <w:rPr>
+          <w:rFonts w:ascii="Times New Roman" w:hAnsi="Times New Roman" w:cs="Times New Roman"/>
+        </w:rPr>
+      </w:pPr>
+      <w:r>
+        <w:rPr>
+          <w:rFonts w:ascii="Times New Roman" w:hAnsi="Times New Roman" w:cs="Times New Roman"/>
+          <w:noProof/>
+        </w:rPr>
+        <w:drawing>
+          <wp:inline distT="0" distB="0" distL="0" distR="0" wp14:anchorId="2A2B9867" wp14:editId="032A43BC">
+            <wp:extent cx="1474347" cy="1249447"/>
+            <wp:effectExtent l="0" t="0" r="0" b="8255"/>
+            <wp:docPr id="1613144291" name="Picture 1"/>
+            <wp:cNvGraphicFramePr>
+              <a:graphicFrameLocks xmlns:a="http://schemas.openxmlformats.org/drawingml/2006/main" noChangeAspect="1"/>
+            </wp:cNvGraphicFramePr>
+            <a:graphic xmlns:a="http://schemas.openxmlformats.org/drawingml/2006/main">
+              <a:graphicData uri="http://schemas.openxmlformats.org/drawingml/2006/picture">
+                <pic:pic xmlns:pic="http://schemas.openxmlformats.org/drawingml/2006/picture">
+                  <pic:nvPicPr>
+                    <pic:cNvPr id="1613144291" name="Picture 1613144291"/>
+                    <pic:cNvPicPr/>
+                  </pic:nvPicPr>
+                  <pic:blipFill>
+                    <a:blip r:embed="rId5" cstate="print">
+                      <a:extLst>
+                        <a:ext uri="{28A0092B-C50C-407E-A947-70E740481C1C}">
+                          <a14:useLocalDpi xmlns:a14="http://schemas.microsoft.com/office/drawing/2010/main" val="0"/>
+                        </a:ext>
+                      </a:extLst>
+                    </a:blip>
+                    <a:stretch>
+                      <a:fillRect/>
+                    </a:stretch>
+                  </pic:blipFill>
+                  <pic:spPr>
+                    <a:xfrm>
+                      <a:off x="0" y="0"/>
+                      <a:ext cx="1481745" cy="1255716"/>
+                    </a:xfrm>
+                    <a:prstGeom prst="rect">
+                      <a:avLst/>
+                    </a:prstGeom>
+                  </pic:spPr>
+                </pic:pic>
+              </a:graphicData>
+            </a:graphic>
+          </wp:inline>
+        </w:drawing>
+      </w:r>
+    </w:p>
+    <w:p>
+      <w:pPr>
+        <w:jc w:val="center"/>
+        <w:rPr>
+          <w:rFonts w:ascii="Times New Roman" w:hAnsi="Times New Roman" w:cs="Times New Roman"/>
+        </w:rPr>
+      </w:pPr>
+      <w:r>
+        <w:rPr>
+          <w:rFonts w:ascii="Times New Roman" w:hAnsi="Times New Roman" w:cs="Times New Roman"/>
+        </w:rPr>
+        <w:t xml:space="preserve">Fig: </w:t>
+      </w:r>
+      <w:r>
+        <w:rPr>
+          <w:rFonts w:ascii="Times New Roman" w:hAnsi="Times New Roman" w:cs="Times New Roman"/>
+        </w:rPr>
+        <w:t>V2V Automation using LoRa</w:t>
+      </w:r>
+    </w:p>
+    <w:p>
+      <w:pPr>
+        <w:jc w:val="center"/>
+        <w:rPr>
+          <w:rFonts w:ascii="Times New Roman" w:hAnsi="Times New Roman" w:cs="Times New Roman"/>
+        </w:rPr>
+      </w:pPr>
+    </w:p>
+    <w:p>
+      <w:pPr>
+        <w:jc w:val="center"/>
+        <w:rPr>
+          <w:rFonts w:ascii="Times New Roman" w:hAnsi="Times New Roman" w:cs="Times New Roman"/>
+        </w:rPr>
+      </w:pPr>
+      <w:r>
+        <w:rPr>
+          <w:rFonts w:ascii="Times New Roman" w:hAnsi="Times New Roman" w:cs="Times New Roman"/>
+          <w:noProof/>
+        </w:rPr>
+        <w:lastRenderedPageBreak/>
+        <w:drawing>
+          <wp:inline distT="0" distB="0" distL="0" distR="0" wp14:anchorId="380F0F0B" wp14:editId="64C65B69">
+            <wp:extent cx="2596616" cy="1938534"/>
+            <wp:effectExtent l="0" t="0" r="0" b="5080"/>
+            <wp:docPr id="1693388853" name="Picture 2"/>
+            <wp:cNvGraphicFramePr>
+              <a:graphicFrameLocks xmlns:a="http://schemas.openxmlformats.org/drawingml/2006/main" noChangeAspect="1"/>
+            </wp:cNvGraphicFramePr>
+            <a:graphic xmlns:a="http://schemas.openxmlformats.org/drawingml/2006/main">
+              <a:graphicData uri="http://schemas.openxmlformats.org/drawingml/2006/picture">
+                <pic:pic xmlns:pic="http://schemas.openxmlformats.org/drawingml/2006/picture">
+                  <pic:nvPicPr>
+                    <pic:cNvPr id="1693388853" name="Picture 1693388853"/>
+                    <pic:cNvPicPr/>
+                  </pic:nvPicPr>
+                  <pic:blipFill>
+                    <a:blip r:embed="rId6">
+                      <a:extLst>
+                        <a:ext uri="{28A0092B-C50C-407E-A947-70E740481C1C}">
+                          <a14:useLocalDpi xmlns:a14="http://schemas.microsoft.com/office/drawing/2010/main" val="0"/>
+                        </a:ext>
+                      </a:extLst>
+                    </a:blip>
+                    <a:stretch>
+                      <a:fillRect/>
+                    </a:stretch>
+                  </pic:blipFill>
+                  <pic:spPr>
+                    <a:xfrm>
+                      <a:off x="0" y="0"/>
+                      <a:ext cx="2601833" cy="1942429"/>
+                    </a:xfrm>
+                    <a:prstGeom prst="rect">
+                      <a:avLst/>
+                    </a:prstGeom>
+                  </pic:spPr>
+                </pic:pic>
+              </a:graphicData>
+            </a:graphic>
+          </wp:inline>
+        </w:drawing>
+      </w:r>
+    </w:p>
+    <w:p>
+      <w:pPr>
+        <w:jc w:val="center"/>
+        <w:rPr>
+          <w:rFonts w:ascii="Times New Roman" w:hAnsi="Times New Roman" w:cs="Times New Roman"/>
+        </w:rPr>
+      </w:pPr>
+      <w:r>
+        <w:rPr>
+          <w:rFonts w:ascii="Times New Roman" w:hAnsi="Times New Roman" w:cs="Times New Roman"/>
+        </w:rPr>
+        <w:t xml:space="preserve">Fig: </w:t>
+      </w:r>
+      <w:r>
+        <w:rPr>
+          <w:rFonts w:ascii="Times New Roman" w:hAnsi="Times New Roman" w:cs="Times New Roman"/>
+        </w:rPr>
+        <w:t>Hazard Warning is being transmitted</w:t>
+      </w:r>
+    </w:p>
+    <w:p>
+      <w:pPr>
+        <w:jc w:val="center"/>
+        <w:rPr>
+          <w:rFonts w:ascii="Times New Roman" w:hAnsi="Times New Roman" w:cs="Times New Roman"/>
+        </w:rPr>
+      </w:pPr>
+      <w:r>
+        <w:rPr>
+          <w:rFonts w:ascii="Times New Roman" w:hAnsi="Times New Roman" w:cs="Times New Roman"/>
+          <w:noProof/>
+        </w:rPr>
+        <w:drawing>
+          <wp:inline distT="0" distB="0" distL="0" distR="0" wp14:anchorId="264A95F1" wp14:editId="1CB0E8B8">
+            <wp:extent cx="2638497" cy="1978873"/>
+            <wp:effectExtent l="0" t="0" r="0" b="2540"/>
+            <wp:docPr id="1987762020" name="Picture 3"/>
+            <wp:cNvGraphicFramePr>
+              <a:graphicFrameLocks xmlns:a="http://schemas.openxmlformats.org/drawingml/2006/main" noChangeAspect="1"/>
+            </wp:cNvGraphicFramePr>
+            <a:graphic xmlns:a="http://schemas.openxmlformats.org/drawingml/2006/main">
+              <a:graphicData uri="http://schemas.openxmlformats.org/drawingml/2006/picture">
+                <pic:pic xmlns:pic="http://schemas.openxmlformats.org/drawingml/2006/picture">
+                  <pic:nvPicPr>
+                    <pic:cNvPr id="1987762020" name="Picture 1987762020"/>
+                    <pic:cNvPicPr/>
+                  </pic:nvPicPr>
+                  <pic:blipFill>
+                    <a:blip r:embed="rId7">
+                      <a:extLst>
+                        <a:ext uri="{28A0092B-C50C-407E-A947-70E740481C1C}">
+                          <a14:useLocalDpi xmlns:a14="http://schemas.microsoft.com/office/drawing/2010/main" val="0"/>
+                        </a:ext>
+                      </a:extLst>
+                    </a:blip>
+                    <a:stretch>
+                      <a:fillRect/>
+                    </a:stretch>
+                  </pic:blipFill>
+                  <pic:spPr>
+                    <a:xfrm>
+                      <a:off x="0" y="0"/>
+                      <a:ext cx="2652823" cy="1989617"/>
+                    </a:xfrm>
+                    <a:prstGeom prst="rect">
+                      <a:avLst/>
+                    </a:prstGeom>
+                  </pic:spPr>
+                </pic:pic>
+              </a:graphicData>
+            </a:graphic>
+          </wp:inline>
+        </w:drawing>
+      </w:r>
+    </w:p>
+    <w:p>
+      <w:pPr>
+        <w:jc w:val="center"/>
+        <w:rPr>
+          <w:rFonts w:ascii="Times New Roman" w:hAnsi="Times New Roman" w:cs="Times New Roman"/>
+        </w:rPr>
+      </w:pPr>
+      <w:r>
+        <w:rPr>
+          <w:rFonts w:ascii="Times New Roman" w:hAnsi="Times New Roman" w:cs="Times New Roman"/>
+        </w:rPr>
+        <w:t xml:space="preserve">Fig: </w:t>
+      </w:r>
+      <w:r>
+        <w:rPr>
+          <w:rFonts w:ascii="Times New Roman" w:hAnsi="Times New Roman" w:cs="Times New Roman"/>
+        </w:rPr>
+        <w:t>Emergency signal is being Transmitted</w:t>
+      </w:r>
+    </w:p>
+    <w:p>
+      <w:pPr>
         <w:rPr>
           <w:rFonts w:ascii="Times New Roman" w:hAnsi="Times New Roman" w:cs="Times New Roman"/>
         </w:rPr>
@@ -5963,7 +6197,7 @@
           <w:rFonts w:ascii="Times New Roman" w:hAnsi="Times New Roman" w:cs="Times New Roman"/>
         </w:rPr>
         <w:pict w14:anchorId="4BF196EE">
-          <v:rect id="_x0000_i1231" style="width:0;height:1.5pt" o:hralign="center" o:hrstd="t" o:hr="t" fillcolor="#a0a0a0" stroked="f"/>
+          <v:rect id="_x0000_i1051" style="width:0;height:1.5pt" o:hralign="center" o:hrstd="t" o:hr="t" fillcolor="#a0a0a0" stroked="f"/>
         </w:pict>
       </w:r>
     </w:p>
@@ -6079,137 +6313,243 @@
         <w:rPr>
           <w:rFonts w:ascii="Times New Roman" w:hAnsi="Times New Roman" w:cs="Times New Roman"/>
         </w:rPr>
+        <w:t>Mobile application integration</w:t>
+      </w:r>
+    </w:p>
+    <w:p>
+      <w:pPr>
+        <w:numPr>
+          <w:ilvl w:val="0"/>
+          <w:numId w:val="25"/>
+        </w:numPr>
+        <w:rPr>
+          <w:rFonts w:ascii="Times New Roman" w:hAnsi="Times New Roman" w:cs="Times New Roman"/>
+        </w:rPr>
+      </w:pPr>
+      <w:r>
+        <w:rPr>
+          <w:rFonts w:ascii="Times New Roman" w:hAnsi="Times New Roman" w:cs="Times New Roman"/>
+        </w:rPr>
+        <w:t>Cloud connectivity</w:t>
+      </w:r>
+    </w:p>
+    <w:p>
+      <w:pPr>
+        <w:numPr>
+          <w:ilvl w:val="0"/>
+          <w:numId w:val="25"/>
+        </w:numPr>
+        <w:rPr>
+          <w:rFonts w:ascii="Times New Roman" w:hAnsi="Times New Roman" w:cs="Times New Roman"/>
+        </w:rPr>
+      </w:pPr>
+      <w:r>
+        <w:rPr>
+          <w:rFonts w:ascii="Times New Roman" w:hAnsi="Times New Roman" w:cs="Times New Roman"/>
+        </w:rPr>
+        <w:t>Adaptive communication protocols</w:t>
+      </w:r>
+    </w:p>
+    <w:p>
+      <w:pPr>
+        <w:numPr>
+          <w:ilvl w:val="0"/>
+          <w:numId w:val="25"/>
+        </w:numPr>
+        <w:rPr>
+          <w:rFonts w:ascii="Times New Roman" w:hAnsi="Times New Roman" w:cs="Times New Roman"/>
+        </w:rPr>
+      </w:pPr>
+      <w:r>
+        <w:rPr>
+          <w:rFonts w:ascii="Times New Roman" w:hAnsi="Times New Roman" w:cs="Times New Roman"/>
+        </w:rPr>
+        <w:t>Vehicle sensor integration</w:t>
+      </w:r>
+    </w:p>
+    <w:p>
+      <w:pPr>
+        <w:numPr>
+          <w:ilvl w:val="0"/>
+          <w:numId w:val="25"/>
+        </w:numPr>
+        <w:rPr>
+          <w:rFonts w:ascii="Times New Roman" w:hAnsi="Times New Roman" w:cs="Times New Roman"/>
+        </w:rPr>
+      </w:pPr>
+      <w:r>
+        <w:rPr>
+          <w:rFonts w:ascii="Times New Roman" w:hAnsi="Times New Roman" w:cs="Times New Roman"/>
+        </w:rPr>
+        <w:t>Multi-vehicle networking</w:t>
+      </w:r>
+    </w:p>
+    <w:p>
+      <w:pPr>
+        <w:numPr>
+          <w:ilvl w:val="0"/>
+          <w:numId w:val="25"/>
+        </w:numPr>
+        <w:rPr>
+          <w:rFonts w:ascii="Times New Roman" w:hAnsi="Times New Roman" w:cs="Times New Roman"/>
+        </w:rPr>
+      </w:pPr>
+      <w:r>
+        <w:rPr>
+          <w:rFonts w:ascii="Times New Roman" w:hAnsi="Times New Roman" w:cs="Times New Roman"/>
+        </w:rPr>
+        <w:t>Voice-based alerts</w:t>
+      </w:r>
+    </w:p>
+    <w:p>
+      <w:pPr>
+        <w:numPr>
+          <w:ilvl w:val="0"/>
+          <w:numId w:val="25"/>
+        </w:numPr>
+        <w:rPr>
+          <w:rFonts w:ascii="Times New Roman" w:hAnsi="Times New Roman" w:cs="Times New Roman"/>
+        </w:rPr>
+      </w:pPr>
+      <w:r>
+        <w:rPr>
+          <w:rFonts w:ascii="Times New Roman" w:hAnsi="Times New Roman" w:cs="Times New Roman"/>
+        </w:rPr>
+        <w:t>Solar-powered vehicle nodes</w:t>
+      </w:r>
+    </w:p>
+    <w:p>
+      <w:pPr>
+        <w:rPr>
+          <w:rFonts w:ascii="Times New Roman" w:hAnsi="Times New Roman" w:cs="Times New Roman"/>
+        </w:rPr>
+      </w:pPr>
+      <w:r>
+        <w:rPr>
+          <w:rFonts w:ascii="Times New Roman" w:hAnsi="Times New Roman" w:cs="Times New Roman"/>
+        </w:rPr>
+        <w:t>Future improvements can transform the project into a complete intelligent transportation platform.</w:t>
+      </w:r>
+    </w:p>
+    <w:p>
+      <w:pPr>
+        <w:rPr>
+          <w:rFonts w:ascii="Times New Roman" w:hAnsi="Times New Roman" w:cs="Times New Roman"/>
+        </w:rPr>
+      </w:pPr>
+      <w:r>
+        <w:rPr>
+          <w:rFonts w:ascii="Times New Roman" w:hAnsi="Times New Roman" w:cs="Times New Roman"/>
+        </w:rPr>
+        <w:pict w14:anchorId="0E3800A8">
+          <v:rect id="_x0000_i1052" style="width:0;height:1.5pt" o:hralign="center" o:hrstd="t" o:hr="t" fillcolor="#a0a0a0" stroked="f"/>
+        </w:pict>
+      </w:r>
+    </w:p>
+    <w:p>
+      <w:pPr>
+        <w:rPr>
+          <w:rFonts w:ascii="Times New Roman" w:hAnsi="Times New Roman" w:cs="Times New Roman"/>
+          <w:b/>
+          <w:bCs/>
+        </w:rPr>
+      </w:pPr>
+    </w:p>
+    <w:p>
+      <w:pPr>
+        <w:rPr>
+          <w:rFonts w:ascii="Times New Roman" w:hAnsi="Times New Roman" w:cs="Times New Roman"/>
+          <w:b/>
+          <w:bCs/>
+        </w:rPr>
+      </w:pPr>
+      <w:r>
+        <w:rPr>
+          <w:rFonts w:ascii="Times New Roman" w:hAnsi="Times New Roman" w:cs="Times New Roman"/>
+          <w:b/>
+          <w:bCs/>
+        </w:rPr>
         <w:lastRenderedPageBreak/>
-        <w:t>Mobile application integration</w:t>
-      </w:r>
-    </w:p>
-    <w:p>
-      <w:pPr>
-        <w:numPr>
-          <w:ilvl w:val="0"/>
-          <w:numId w:val="25"/>
-        </w:numPr>
-        <w:rPr>
-          <w:rFonts w:ascii="Times New Roman" w:hAnsi="Times New Roman" w:cs="Times New Roman"/>
-        </w:rPr>
-      </w:pPr>
-      <w:r>
-        <w:rPr>
-          <w:rFonts w:ascii="Times New Roman" w:hAnsi="Times New Roman" w:cs="Times New Roman"/>
-        </w:rPr>
-        <w:t>Cloud connectivity</w:t>
-      </w:r>
-    </w:p>
-    <w:p>
-      <w:pPr>
-        <w:numPr>
-          <w:ilvl w:val="0"/>
-          <w:numId w:val="25"/>
-        </w:numPr>
-        <w:rPr>
-          <w:rFonts w:ascii="Times New Roman" w:hAnsi="Times New Roman" w:cs="Times New Roman"/>
-        </w:rPr>
-      </w:pPr>
-      <w:r>
-        <w:rPr>
-          <w:rFonts w:ascii="Times New Roman" w:hAnsi="Times New Roman" w:cs="Times New Roman"/>
-        </w:rPr>
-        <w:t>Adaptive communication protocols</w:t>
-      </w:r>
-    </w:p>
-    <w:p>
-      <w:pPr>
-        <w:numPr>
-          <w:ilvl w:val="0"/>
-          <w:numId w:val="25"/>
-        </w:numPr>
-        <w:rPr>
-          <w:rFonts w:ascii="Times New Roman" w:hAnsi="Times New Roman" w:cs="Times New Roman"/>
-        </w:rPr>
-      </w:pPr>
-      <w:r>
-        <w:rPr>
-          <w:rFonts w:ascii="Times New Roman" w:hAnsi="Times New Roman" w:cs="Times New Roman"/>
-        </w:rPr>
-        <w:t>Vehicle sensor integration</w:t>
-      </w:r>
-    </w:p>
-    <w:p>
-      <w:pPr>
-        <w:numPr>
-          <w:ilvl w:val="0"/>
-          <w:numId w:val="25"/>
-        </w:numPr>
-        <w:rPr>
-          <w:rFonts w:ascii="Times New Roman" w:hAnsi="Times New Roman" w:cs="Times New Roman"/>
-        </w:rPr>
-      </w:pPr>
-      <w:r>
-        <w:rPr>
-          <w:rFonts w:ascii="Times New Roman" w:hAnsi="Times New Roman" w:cs="Times New Roman"/>
-        </w:rPr>
-        <w:t>Multi-vehicle networking</w:t>
-      </w:r>
-    </w:p>
-    <w:p>
-      <w:pPr>
-        <w:numPr>
-          <w:ilvl w:val="0"/>
-          <w:numId w:val="25"/>
-        </w:numPr>
-        <w:rPr>
-          <w:rFonts w:ascii="Times New Roman" w:hAnsi="Times New Roman" w:cs="Times New Roman"/>
-        </w:rPr>
-      </w:pPr>
-      <w:r>
-        <w:rPr>
-          <w:rFonts w:ascii="Times New Roman" w:hAnsi="Times New Roman" w:cs="Times New Roman"/>
-        </w:rPr>
-        <w:t>Voice-based alerts</w:t>
-      </w:r>
-    </w:p>
-    <w:p>
-      <w:pPr>
-        <w:numPr>
-          <w:ilvl w:val="0"/>
-          <w:numId w:val="25"/>
-        </w:numPr>
-        <w:rPr>
-          <w:rFonts w:ascii="Times New Roman" w:hAnsi="Times New Roman" w:cs="Times New Roman"/>
-        </w:rPr>
-      </w:pPr>
-      <w:r>
-        <w:rPr>
-          <w:rFonts w:ascii="Times New Roman" w:hAnsi="Times New Roman" w:cs="Times New Roman"/>
-        </w:rPr>
-        <w:t>Solar-powered vehicle nodes</w:t>
-      </w:r>
-    </w:p>
-    <w:p>
-      <w:pPr>
-        <w:rPr>
-          <w:rFonts w:ascii="Times New Roman" w:hAnsi="Times New Roman" w:cs="Times New Roman"/>
-        </w:rPr>
-      </w:pPr>
-      <w:r>
-        <w:rPr>
-          <w:rFonts w:ascii="Times New Roman" w:hAnsi="Times New Roman" w:cs="Times New Roman"/>
-        </w:rPr>
-        <w:t>Future improvements can transform the project into a complete intelligent transportation platform.</w:t>
-      </w:r>
-    </w:p>
-    <w:p>
-      <w:pPr>
-        <w:rPr>
-          <w:rFonts w:ascii="Times New Roman" w:hAnsi="Times New Roman" w:cs="Times New Roman"/>
-        </w:rPr>
-      </w:pPr>
-      <w:r>
-        <w:rPr>
-          <w:rFonts w:ascii="Times New Roman" w:hAnsi="Times New Roman" w:cs="Times New Roman"/>
-        </w:rPr>
-        <w:pict w14:anchorId="0E3800A8">
-          <v:rect id="_x0000_i1232" style="width:0;height:1.5pt" o:hralign="center" o:hrstd="t" o:hr="t" fillcolor="#a0a0a0" stroked="f"/>
+        <w:t>13. CONCLUSION</w:t>
+      </w:r>
+    </w:p>
+    <w:p>
+      <w:pPr>
+        <w:rPr>
+          <w:rFonts w:ascii="Times New Roman" w:hAnsi="Times New Roman" w:cs="Times New Roman"/>
+        </w:rPr>
+      </w:pPr>
+      <w:r>
+        <w:rPr>
+          <w:rFonts w:ascii="Times New Roman" w:hAnsi="Times New Roman" w:cs="Times New Roman"/>
+        </w:rPr>
+        <w:t>The V2V HAZARD ALERT system successfully demonstrates an infrastructure-independent Vehicle-to-Vehicle communication platform using ESP32 and LoRa technology. The proposed system provides efficient real-time hazard communication between vehicles without requiring cellular connectivity or roadside infrastructure.</w:t>
+      </w:r>
+    </w:p>
+    <w:p>
+      <w:pPr>
+        <w:rPr>
+          <w:rFonts w:ascii="Times New Roman" w:hAnsi="Times New Roman" w:cs="Times New Roman"/>
+        </w:rPr>
+      </w:pPr>
+      <w:r>
+        <w:rPr>
+          <w:rFonts w:ascii="Times New Roman" w:hAnsi="Times New Roman" w:cs="Times New Roman"/>
+        </w:rPr>
+        <w:t>The project achieves long-range communication with low power consumption and fast response time. The integration of OLED displays, buzzers, and LEDs improves driver awareness and safety.</w:t>
+      </w:r>
+    </w:p>
+    <w:p>
+      <w:pPr>
+        <w:rPr>
+          <w:rFonts w:ascii="Times New Roman" w:hAnsi="Times New Roman" w:cs="Times New Roman"/>
+        </w:rPr>
+      </w:pPr>
+      <w:r>
+        <w:rPr>
+          <w:rFonts w:ascii="Times New Roman" w:hAnsi="Times New Roman" w:cs="Times New Roman"/>
+        </w:rPr>
+        <w:t>Experimental testing confirms reliable communication performance under different environmental conditions including open-field, line-of-sight, and non-line-of-sight scenarios.</w:t>
+      </w:r>
+    </w:p>
+    <w:p>
+      <w:pPr>
+        <w:rPr>
+          <w:rFonts w:ascii="Times New Roman" w:hAnsi="Times New Roman" w:cs="Times New Roman"/>
+        </w:rPr>
+      </w:pPr>
+      <w:r>
+        <w:rPr>
+          <w:rFonts w:ascii="Times New Roman" w:hAnsi="Times New Roman" w:cs="Times New Roman"/>
+        </w:rPr>
+        <w:t>The system provides a low-cost, scalable, and practical solution for intelligent transportation systems and road safety applications.</w:t>
+      </w:r>
+    </w:p>
+    <w:p>
+      <w:pPr>
+        <w:rPr>
+          <w:rFonts w:ascii="Times New Roman" w:hAnsi="Times New Roman" w:cs="Times New Roman"/>
+        </w:rPr>
+      </w:pPr>
+      <w:r>
+        <w:rPr>
+          <w:rFonts w:ascii="Times New Roman" w:hAnsi="Times New Roman" w:cs="Times New Roman"/>
+        </w:rPr>
+        <w:t>The proposed project demonstrates the practical application of embedded systems, IoT communication, wireless networking, and intelligent transportation technologies.</w:t>
+      </w:r>
+    </w:p>
+    <w:p>
+      <w:pPr>
+        <w:rPr>
+          <w:rFonts w:ascii="Times New Roman" w:hAnsi="Times New Roman" w:cs="Times New Roman"/>
+        </w:rPr>
+      </w:pPr>
+      <w:r>
+        <w:rPr>
+          <w:rFonts w:ascii="Times New Roman" w:hAnsi="Times New Roman" w:cs="Times New Roman"/>
+        </w:rPr>
+        <w:pict w14:anchorId="157DD87E">
+          <v:rect id="_x0000_i1053" style="width:0;height:1.5pt" o:hralign="center" o:hrstd="t" o:hr="t" fillcolor="#a0a0a0" stroked="f"/>
         </w:pict>
       </w:r>
     </w:p>
@@ -6227,103 +6567,6 @@
           <w:b/>
           <w:bCs/>
         </w:rPr>
-        <w:t>13. CONCLUSION</w:t>
-      </w:r>
-    </w:p>
-    <w:p>
-      <w:pPr>
-        <w:rPr>
-          <w:rFonts w:ascii="Times New Roman" w:hAnsi="Times New Roman" w:cs="Times New Roman"/>
-        </w:rPr>
-      </w:pPr>
-      <w:r>
-        <w:rPr>
-          <w:rFonts w:ascii="Times New Roman" w:hAnsi="Times New Roman" w:cs="Times New Roman"/>
-        </w:rPr>
-        <w:t>The V2V HAZARD ALERT system successfully demonstrates an infrastructure-independent Vehicle-to-Vehicle communication platform using ESP32 and LoRa technology. The proposed system provides efficient real-time hazard communication between vehicles without requiring cellular connectivity or roadside infrastructure.</w:t>
-      </w:r>
-    </w:p>
-    <w:p>
-      <w:pPr>
-        <w:rPr>
-          <w:rFonts w:ascii="Times New Roman" w:hAnsi="Times New Roman" w:cs="Times New Roman"/>
-        </w:rPr>
-      </w:pPr>
-      <w:r>
-        <w:rPr>
-          <w:rFonts w:ascii="Times New Roman" w:hAnsi="Times New Roman" w:cs="Times New Roman"/>
-        </w:rPr>
-        <w:t>The project achieves long-range communication with low power consumption and fast response time. The integration of OLED displays, buzzers, and LEDs improves driver awareness and safety.</w:t>
-      </w:r>
-    </w:p>
-    <w:p>
-      <w:pPr>
-        <w:rPr>
-          <w:rFonts w:ascii="Times New Roman" w:hAnsi="Times New Roman" w:cs="Times New Roman"/>
-        </w:rPr>
-      </w:pPr>
-      <w:r>
-        <w:rPr>
-          <w:rFonts w:ascii="Times New Roman" w:hAnsi="Times New Roman" w:cs="Times New Roman"/>
-        </w:rPr>
-        <w:t>Experimental testing confirms reliable communication performance under different environmental conditions including open-field, line-of-sight, and non-line-of-sight scenarios.</w:t>
-      </w:r>
-    </w:p>
-    <w:p>
-      <w:pPr>
-        <w:rPr>
-          <w:rFonts w:ascii="Times New Roman" w:hAnsi="Times New Roman" w:cs="Times New Roman"/>
-        </w:rPr>
-      </w:pPr>
-      <w:r>
-        <w:rPr>
-          <w:rFonts w:ascii="Times New Roman" w:hAnsi="Times New Roman" w:cs="Times New Roman"/>
-        </w:rPr>
-        <w:t>The system provides a low-cost, scalable, and practical solution for intelligent transportation systems and road safety applications.</w:t>
-      </w:r>
-    </w:p>
-    <w:p>
-      <w:pPr>
-        <w:rPr>
-          <w:rFonts w:ascii="Times New Roman" w:hAnsi="Times New Roman" w:cs="Times New Roman"/>
-        </w:rPr>
-      </w:pPr>
-      <w:r>
-        <w:rPr>
-          <w:rFonts w:ascii="Times New Roman" w:hAnsi="Times New Roman" w:cs="Times New Roman"/>
-        </w:rPr>
-        <w:t>The proposed project demonstrates the practical application of embedded systems, IoT communication, wireless networking, and intelligent transportation technologies.</w:t>
-      </w:r>
-    </w:p>
-    <w:p>
-      <w:pPr>
-        <w:rPr>
-          <w:rFonts w:ascii="Times New Roman" w:hAnsi="Times New Roman" w:cs="Times New Roman"/>
-        </w:rPr>
-      </w:pPr>
-      <w:r>
-        <w:rPr>
-          <w:rFonts w:ascii="Times New Roman" w:hAnsi="Times New Roman" w:cs="Times New Roman"/>
-        </w:rPr>
-        <w:pict w14:anchorId="157DD87E">
-          <v:rect id="_x0000_i1233" style="width:0;height:1.5pt" o:hralign="center" o:hrstd="t" o:hr="t" fillcolor="#a0a0a0" stroked="f"/>
-        </w:pict>
-      </w:r>
-    </w:p>
-    <w:p>
-      <w:pPr>
-        <w:rPr>
-          <w:rFonts w:ascii="Times New Roman" w:hAnsi="Times New Roman" w:cs="Times New Roman"/>
-          <w:b/>
-          <w:bCs/>
-        </w:rPr>
-      </w:pPr>
-      <w:r>
-        <w:rPr>
-          <w:rFonts w:ascii="Times New Roman" w:hAnsi="Times New Roman" w:cs="Times New Roman"/>
-          <w:b/>
-          <w:bCs/>
-        </w:rPr>
         <w:t>REFERENCES</w:t>
       </w:r>
     </w:p>
@@ -6457,7 +6700,7 @@
           <w:rFonts w:ascii="Times New Roman" w:hAnsi="Times New Roman" w:cs="Times New Roman"/>
         </w:rPr>
         <w:pict w14:anchorId="17E71ABD">
-          <v:rect id="_x0000_i1234" style="width:0;height:1.5pt" o:hralign="center" o:hrstd="t" o:hr="t" fillcolor="#a0a0a0" stroked="f"/>
+          <v:rect id="_x0000_i1054" style="width:0;height:1.5pt" o:hralign="center" o:hrstd="t" o:hr="t" fillcolor="#a0a0a0" stroked="f"/>
         </w:pict>
       </w:r>
     </w:p>
@@ -10943,6 +11186,7 @@
   <w:style w:type="character" w:default="1" w:styleId="DefaultParagraphFont">
     <w:name w:val="Default Paragraph Font"/>
     <w:uiPriority w:val="1"/>
+    <w:semiHidden/>
     <w:unhideWhenUsed/>
   </w:style>
   <w:style w:type="table" w:default="1" w:styleId="TableNormal">

</xml_diff>